<commit_message>
Updated practical lesson slides and scripts
</commit_message>
<xml_diff>
--- a/1st_lesson/HW_1.docx
+++ b/1st_lesson/HW_1.docx
@@ -6,11 +6,12 @@
       <w:pPr>
         <w:pStyle w:val="TextBody"/>
         <w:bidi w:val="0"/>
-        <w:spacing w:lineRule="auto" w:line="410" w:before="40" w:after="140"/>
+        <w:spacing w:lineRule="auto" w:line="408" w:before="40" w:after="140"/>
         <w:ind w:right="0" w:hanging="0"/>
         <w:rPr>
           <w:rFonts w:ascii="Arial" w:hAnsi="Arial"/>
           <w:b w:val="false"/>
+          <w:i w:val="false"/>
           <w:i w:val="false"/>
           <w:caps w:val="false"/>
           <w:smallCaps w:val="false"/>
@@ -68,11 +69,12 @@
       <w:pPr>
         <w:pStyle w:val="TextBody"/>
         <w:bidi w:val="0"/>
-        <w:spacing w:lineRule="auto" w:line="410" w:before="40" w:after="140"/>
+        <w:spacing w:lineRule="auto" w:line="408" w:before="40" w:after="140"/>
         <w:ind w:right="0" w:hanging="0"/>
         <w:rPr>
           <w:rFonts w:ascii="Arial" w:hAnsi="Arial"/>
           <w:b w:val="false"/>
+          <w:i w:val="false"/>
           <w:i w:val="false"/>
           <w:caps w:val="false"/>
           <w:smallCaps w:val="false"/>
@@ -109,7 +111,7 @@
       <w:pPr>
         <w:pStyle w:val="TextBody"/>
         <w:bidi w:val="0"/>
-        <w:spacing w:lineRule="auto" w:line="410" w:before="40" w:after="140"/>
+        <w:spacing w:lineRule="auto" w:line="408" w:before="40" w:after="140"/>
         <w:ind w:right="0" w:hanging="0"/>
         <w:rPr>
           <w:rFonts w:ascii="Arial" w:hAnsi="Arial"/>
@@ -133,32 +135,14 @@
           <w:effect w:val="none"/>
           <w:shd w:fill="auto" w:val="clear"/>
         </w:rPr>
-        <w:t xml:space="preserve">1. </w:t>
-      </w:r>
-      <w:r>
-        <w:rPr>
-          <w:rFonts w:ascii="Arial" w:hAnsi="Arial"/>
-          <w:b w:val="false"/>
-          <w:i w:val="false"/>
-          <w:caps w:val="false"/>
-          <w:smallCaps w:val="false"/>
-          <w:strike w:val="false"/>
-          <w:dstrike w:val="false"/>
-          <w:color w:val="000000"/>
-          <w:sz w:val="28"/>
-          <w:szCs w:val="28"/>
-          <w:u w:val="none"/>
-          <w:effect w:val="none"/>
-          <w:shd w:fill="auto" w:val="clear"/>
-        </w:rPr>
-        <w:t>https://github.com/mwaskom/seaborn-data/blob/master/penguins.csv</w:t>
-      </w:r>
-    </w:p>
-    <w:p>
-      <w:pPr>
-        <w:pStyle w:val="TextBody"/>
-        <w:bidi w:val="0"/>
-        <w:spacing w:lineRule="auto" w:line="410" w:before="40" w:after="140"/>
+        <w:t>1. https://github.com/mwaskom/seaborn-data/blob/master/penguins.csv</w:t>
+      </w:r>
+    </w:p>
+    <w:p>
+      <w:pPr>
+        <w:pStyle w:val="TextBody"/>
+        <w:bidi w:val="0"/>
+        <w:spacing w:lineRule="auto" w:line="408" w:before="40" w:after="140"/>
         <w:ind w:right="0" w:hanging="0"/>
         <w:rPr>
           <w:rFonts w:ascii="Arial" w:hAnsi="Arial"/>
@@ -208,11 +192,12 @@
       <w:pPr>
         <w:pStyle w:val="TextBody"/>
         <w:bidi w:val="0"/>
-        <w:spacing w:lineRule="auto" w:line="410" w:before="40" w:after="140"/>
+        <w:spacing w:lineRule="auto" w:line="408" w:before="40" w:after="140"/>
         <w:ind w:right="0" w:hanging="0"/>
         <w:rPr>
           <w:rFonts w:ascii="Arial;sans-serif" w:hAnsi="Arial;sans-serif"/>
           <w:b/>
+          <w:i w:val="false"/>
           <w:i w:val="false"/>
           <w:caps w:val="false"/>
           <w:smallCaps w:val="false"/>
@@ -243,22 +228,6 @@
           <w:shd w:fill="auto" w:val="clear"/>
         </w:rPr>
         <w:tab/>
-      </w:r>
-      <w:r>
-        <w:rPr>
-          <w:rFonts w:ascii="Arial;sans-serif" w:hAnsi="Arial;sans-serif"/>
-          <w:b/>
-          <w:i w:val="false"/>
-          <w:caps w:val="false"/>
-          <w:smallCaps w:val="false"/>
-          <w:strike w:val="false"/>
-          <w:dstrike w:val="false"/>
-          <w:color w:val="000000"/>
-          <w:sz w:val="22"/>
-          <w:u w:val="none"/>
-          <w:effect w:val="none"/>
-          <w:shd w:fill="auto" w:val="clear"/>
-        </w:rPr>
         <w:t>Visualization</w:t>
       </w:r>
     </w:p>
@@ -269,17 +238,16 @@
           <w:ilvl w:val="0"/>
           <w:numId w:val="1"/>
         </w:numPr>
-        <w:pBdr/>
-        <w:tabs>
-          <w:tab w:val="clear" w:pos="709"/>
+        <w:tabs>
           <w:tab w:val="left" w:pos="709" w:leader="none"/>
         </w:tabs>
         <w:bidi w:val="0"/>
-        <w:spacing w:lineRule="auto" w:line="410" w:before="40" w:after="0"/>
+        <w:spacing w:lineRule="auto" w:line="408" w:before="40" w:after="0"/>
         <w:ind w:left="709" w:hanging="283"/>
         <w:rPr>
           <w:rFonts w:ascii="Arial;sans-serif" w:hAnsi="Arial;sans-serif"/>
           <w:b w:val="false"/>
+          <w:i w:val="false"/>
           <w:i w:val="false"/>
           <w:caps w:val="false"/>
           <w:smallCaps w:val="false"/>
@@ -350,17 +318,16 @@
           <w:ilvl w:val="0"/>
           <w:numId w:val="1"/>
         </w:numPr>
-        <w:pBdr/>
-        <w:tabs>
-          <w:tab w:val="clear" w:pos="709"/>
+        <w:tabs>
           <w:tab w:val="left" w:pos="709" w:leader="none"/>
         </w:tabs>
         <w:bidi w:val="0"/>
-        <w:spacing w:lineRule="auto" w:line="410" w:before="0" w:after="0"/>
+        <w:spacing w:lineRule="auto" w:line="408" w:before="0" w:after="0"/>
         <w:ind w:left="709" w:hanging="283"/>
         <w:rPr>
           <w:rFonts w:ascii="Arial;sans-serif" w:hAnsi="Arial;sans-serif"/>
           <w:b w:val="false"/>
+          <w:i w:val="false"/>
           <w:i w:val="false"/>
           <w:caps w:val="false"/>
           <w:smallCaps w:val="false"/>
@@ -433,13 +400,13 @@
           <w:ilvl w:val="0"/>
           <w:numId w:val="0"/>
         </w:numPr>
-        <w:pBdr/>
-        <w:bidi w:val="0"/>
-        <w:spacing w:lineRule="auto" w:line="410" w:before="0" w:after="0"/>
-        <w:ind w:hanging="0"/>
-        <w:rPr>
-          <w:rFonts w:ascii="Arial;sans-serif" w:hAnsi="Arial;sans-serif"/>
-          <w:b w:val="false"/>
+        <w:bidi w:val="0"/>
+        <w:spacing w:lineRule="auto" w:line="408" w:before="0" w:after="0"/>
+        <w:ind w:left="0" w:hanging="0"/>
+        <w:rPr>
+          <w:rFonts w:ascii="Arial;sans-serif" w:hAnsi="Arial;sans-serif"/>
+          <w:b w:val="false"/>
+          <w:i w:val="false"/>
           <w:i w:val="false"/>
           <w:caps w:val="false"/>
           <w:smallCaps w:val="false"/>
@@ -477,17 +444,16 @@
           <w:ilvl w:val="0"/>
           <w:numId w:val="1"/>
         </w:numPr>
-        <w:pBdr/>
-        <w:tabs>
-          <w:tab w:val="clear" w:pos="709"/>
+        <w:tabs>
           <w:tab w:val="left" w:pos="709" w:leader="none"/>
         </w:tabs>
         <w:bidi w:val="0"/>
-        <w:spacing w:lineRule="auto" w:line="410" w:before="0" w:after="0"/>
+        <w:spacing w:lineRule="auto" w:line="408" w:before="0" w:after="0"/>
         <w:ind w:left="709" w:hanging="283"/>
         <w:rPr>
           <w:rFonts w:ascii="Arial;sans-serif" w:hAnsi="Arial;sans-serif"/>
           <w:b w:val="false"/>
+          <w:i w:val="false"/>
           <w:i w:val="false"/>
           <w:caps w:val="false"/>
           <w:smallCaps w:val="false"/>
@@ -525,17 +491,16 @@
           <w:ilvl w:val="0"/>
           <w:numId w:val="1"/>
         </w:numPr>
-        <w:pBdr/>
-        <w:tabs>
-          <w:tab w:val="clear" w:pos="709"/>
+        <w:tabs>
           <w:tab w:val="left" w:pos="709" w:leader="none"/>
         </w:tabs>
         <w:bidi w:val="0"/>
-        <w:spacing w:lineRule="auto" w:line="410" w:before="0" w:after="0"/>
+        <w:spacing w:lineRule="auto" w:line="408" w:before="0" w:after="0"/>
         <w:ind w:left="709" w:hanging="283"/>
         <w:rPr>
           <w:rFonts w:ascii="Arial;sans-serif" w:hAnsi="Arial;sans-serif"/>
           <w:b w:val="false"/>
+          <w:i w:val="false"/>
           <w:i w:val="false"/>
           <w:caps w:val="false"/>
           <w:smallCaps w:val="false"/>
@@ -572,10 +537,9 @@
           <w:ilvl w:val="0"/>
           <w:numId w:val="0"/>
         </w:numPr>
-        <w:pBdr/>
-        <w:bidi w:val="0"/>
-        <w:spacing w:lineRule="auto" w:line="410" w:before="0" w:after="0"/>
-        <w:ind w:hanging="0"/>
+        <w:bidi w:val="0"/>
+        <w:spacing w:lineRule="auto" w:line="408" w:before="0" w:after="0"/>
+        <w:ind w:left="0" w:hanging="0"/>
         <w:rPr>
           <w:b/>
           <w:shd w:fill="auto" w:val="clear"/>
@@ -583,17 +547,8 @@
       </w:pPr>
       <w:r>
         <w:rPr>
-          <w:rFonts w:ascii="Arial;sans-serif" w:hAnsi="Arial;sans-serif"/>
-          <w:b w:val="false"/>
-          <w:i w:val="false"/>
-          <w:caps w:val="false"/>
-          <w:smallCaps w:val="false"/>
-          <w:strike w:val="false"/>
-          <w:dstrike w:val="false"/>
-          <w:color w:val="000000"/>
-          <w:sz w:val="22"/>
-          <w:u w:val="none"/>
-          <w:effect w:val="none"/>
+          <w:b/>
+          <w:shd w:fill="auto" w:val="clear"/>
         </w:rPr>
       </w:r>
     </w:p>
@@ -604,13 +559,13 @@
           <w:ilvl w:val="0"/>
           <w:numId w:val="0"/>
         </w:numPr>
-        <w:pBdr/>
-        <w:bidi w:val="0"/>
-        <w:spacing w:lineRule="auto" w:line="410" w:before="0" w:after="0"/>
-        <w:ind w:hanging="0"/>
-        <w:rPr>
-          <w:rFonts w:ascii="Arial;sans-serif" w:hAnsi="Arial;sans-serif"/>
-          <w:b w:val="false"/>
+        <w:bidi w:val="0"/>
+        <w:spacing w:lineRule="auto" w:line="408" w:before="0" w:after="0"/>
+        <w:ind w:left="0" w:hanging="0"/>
+        <w:rPr>
+          <w:rFonts w:ascii="Arial;sans-serif" w:hAnsi="Arial;sans-serif"/>
+          <w:b w:val="false"/>
+          <w:i w:val="false"/>
           <w:i w:val="false"/>
           <w:caps w:val="false"/>
           <w:smallCaps w:val="false"/>
@@ -647,17 +602,16 @@
           <w:ilvl w:val="0"/>
           <w:numId w:val="1"/>
         </w:numPr>
-        <w:pBdr/>
-        <w:tabs>
-          <w:tab w:val="clear" w:pos="709"/>
+        <w:tabs>
           <w:tab w:val="left" w:pos="709" w:leader="none"/>
         </w:tabs>
         <w:bidi w:val="0"/>
-        <w:spacing w:lineRule="auto" w:line="410" w:before="0" w:after="0"/>
+        <w:spacing w:lineRule="auto" w:line="408" w:before="0" w:after="0"/>
         <w:ind w:left="709" w:hanging="283"/>
         <w:rPr>
           <w:rFonts w:ascii="Arial;sans-serif" w:hAnsi="Arial;sans-serif"/>
           <w:b w:val="false"/>
+          <w:i w:val="false"/>
           <w:i w:val="false"/>
           <w:caps w:val="false"/>
           <w:smallCaps w:val="false"/>
@@ -694,10 +648,9 @@
           <w:ilvl w:val="0"/>
           <w:numId w:val="0"/>
         </w:numPr>
-        <w:pBdr/>
-        <w:bidi w:val="0"/>
-        <w:spacing w:lineRule="auto" w:line="410" w:before="0" w:after="0"/>
-        <w:ind w:hanging="0"/>
+        <w:bidi w:val="0"/>
+        <w:spacing w:lineRule="auto" w:line="408" w:before="0" w:after="0"/>
+        <w:ind w:left="0" w:hanging="0"/>
         <w:rPr>
           <w:b/>
           <w:shd w:fill="auto" w:val="clear"/>
@@ -705,17 +658,8 @@
       </w:pPr>
       <w:r>
         <w:rPr>
-          <w:rFonts w:ascii="Arial;sans-serif" w:hAnsi="Arial;sans-serif"/>
-          <w:b w:val="false"/>
-          <w:i w:val="false"/>
-          <w:caps w:val="false"/>
-          <w:smallCaps w:val="false"/>
-          <w:strike w:val="false"/>
-          <w:dstrike w:val="false"/>
-          <w:color w:val="000000"/>
-          <w:sz w:val="22"/>
-          <w:u w:val="none"/>
-          <w:effect w:val="none"/>
+          <w:b/>
+          <w:shd w:fill="auto" w:val="clear"/>
         </w:rPr>
       </w:r>
     </w:p>
@@ -726,13 +670,13 @@
           <w:ilvl w:val="0"/>
           <w:numId w:val="0"/>
         </w:numPr>
-        <w:pBdr/>
-        <w:bidi w:val="0"/>
-        <w:spacing w:lineRule="auto" w:line="410" w:before="0" w:after="0"/>
-        <w:ind w:hanging="0"/>
-        <w:rPr>
-          <w:rFonts w:ascii="Arial;sans-serif" w:hAnsi="Arial;sans-serif"/>
-          <w:b w:val="false"/>
+        <w:bidi w:val="0"/>
+        <w:spacing w:lineRule="auto" w:line="408" w:before="0" w:after="0"/>
+        <w:ind w:left="0" w:hanging="0"/>
+        <w:rPr>
+          <w:rFonts w:ascii="Arial;sans-serif" w:hAnsi="Arial;sans-serif"/>
+          <w:b w:val="false"/>
+          <w:i w:val="false"/>
           <w:i w:val="false"/>
           <w:caps w:val="false"/>
           <w:smallCaps w:val="false"/>
@@ -769,17 +713,16 @@
           <w:ilvl w:val="0"/>
           <w:numId w:val="1"/>
         </w:numPr>
-        <w:pBdr/>
-        <w:tabs>
-          <w:tab w:val="clear" w:pos="709"/>
+        <w:tabs>
           <w:tab w:val="left" w:pos="709" w:leader="none"/>
         </w:tabs>
         <w:bidi w:val="0"/>
-        <w:spacing w:lineRule="auto" w:line="410" w:before="0" w:after="140"/>
+        <w:spacing w:lineRule="auto" w:line="408" w:before="0" w:after="140"/>
         <w:ind w:left="709" w:hanging="283"/>
         <w:rPr>
           <w:rFonts w:ascii="Arial;sans-serif" w:hAnsi="Arial;sans-serif"/>
           <w:b w:val="false"/>
+          <w:i w:val="false"/>
           <w:i w:val="false"/>
           <w:caps w:val="false"/>
           <w:smallCaps w:val="false"/>
@@ -854,19 +797,33 @@
           <w:rFonts w:ascii="Arial;sans-serif" w:hAnsi="Arial;sans-serif"/>
           <w:b w:val="false"/>
           <w:i w:val="false"/>
-          <w:caps w:val="false"/>
-          <w:smallCaps w:val="false"/>
-          <w:strike w:val="false"/>
-          <w:dstrike w:val="false"/>
-          <w:color w:val="000000"/>
-          <w:sz w:val="22"/>
-          <w:u w:val="none"/>
-          <w:effect w:val="none"/>
-          <w:shd w:fill="auto" w:val="clear"/>
-        </w:rPr>
-      </w:pPr>
-      <w:r>
-        <w:rPr/>
+          <w:i w:val="false"/>
+          <w:caps w:val="false"/>
+          <w:smallCaps w:val="false"/>
+          <w:strike w:val="false"/>
+          <w:dstrike w:val="false"/>
+          <w:color w:val="000000"/>
+          <w:sz w:val="22"/>
+          <w:u w:val="none"/>
+          <w:effect w:val="none"/>
+          <w:shd w:fill="auto" w:val="clear"/>
+        </w:rPr>
+      </w:pPr>
+      <w:r>
+        <w:rPr>
+          <w:rFonts w:ascii="Arial;sans-serif" w:hAnsi="Arial;sans-serif"/>
+          <w:b w:val="false"/>
+          <w:i w:val="false"/>
+          <w:caps w:val="false"/>
+          <w:smallCaps w:val="false"/>
+          <w:strike w:val="false"/>
+          <w:dstrike w:val="false"/>
+          <w:color w:val="000000"/>
+          <w:sz w:val="22"/>
+          <w:u w:val="none"/>
+          <w:effect w:val="none"/>
+          <w:shd w:fill="auto" w:val="clear"/>
+        </w:rPr>
       </w:r>
     </w:p>
     <w:p>
@@ -943,7 +900,24 @@
           <w:effect w:val="none"/>
           <w:shd w:fill="auto" w:val="clear"/>
         </w:rPr>
-        <w:t>before 19/04/25</w:t>
+        <w:t>before 19/04/2</w:t>
+      </w:r>
+      <w:r>
+        <w:rPr>
+          <w:rFonts w:ascii="Arial;sans-serif" w:hAnsi="Arial;sans-serif"/>
+          <w:b w:val="false"/>
+          <w:i w:val="false"/>
+          <w:caps w:val="false"/>
+          <w:smallCaps w:val="false"/>
+          <w:strike w:val="false"/>
+          <w:dstrike w:val="false"/>
+          <w:color w:val="000000"/>
+          <w:sz w:val="22"/>
+          <w:u w:val="none"/>
+          <w:effect w:val="none"/>
+          <w:shd w:fill="auto" w:val="clear"/>
+        </w:rPr>
+        <w:t>6</w:t>
       </w:r>
     </w:p>
     <w:sectPr>
@@ -953,6 +927,7 @@
       <w:pgNumType w:fmt="decimal"/>
       <w:formProt w:val="false"/>
       <w:textDirection w:val="lrTb"/>
+      <w:docGrid w:type="default" w:linePitch="100" w:charSpace="0"/>
     </w:sectPr>
   </w:body>
 </w:document>
@@ -1221,7 +1196,6 @@
     </w:rPrDefault>
     <w:pPrDefault>
       <w:pPr>
-        <w:widowControl/>
         <w:suppressAutoHyphens w:val="true"/>
       </w:pPr>
     </w:pPrDefault>
@@ -1231,7 +1205,10 @@
     <w:qFormat/>
     <w:pPr>
       <w:widowControl/>
+      <w:suppressAutoHyphens w:val="true"/>
       <w:bidi w:val="0"/>
+      <w:spacing w:before="0" w:after="0"/>
+      <w:jc w:val="left"/>
     </w:pPr>
     <w:rPr>
       <w:rFonts w:ascii="Liberation Serif" w:hAnsi="Liberation Serif" w:eastAsia="Noto Serif CJK SC" w:cs="Lohit Devanagari"/>

</xml_diff>